<commit_message>
Add rank correlation and directional-statistics sections to Session 1
</commit_message>
<xml_diff>
--- a/Student_Manual.docx
+++ b/Student_Manual.docx
@@ -248,7 +248,7 @@
         <w:spacing w:after="160"/>
       </w:pPr>
       <w:r>
-        <w:t xml:space="preserve">The module opens with real data, not AI: Session 1 works entirely with real measurements — rock densities and geochemical concentrations — computing the same summary statistics a geologist would compute in any field report, before any model of any kind gets fitted to anything. Every notebook from Session 2 onward then follows the same pattern as the companion module's pygplates workflows: a USER CONFIGURATION cell near the top marks the handful of things you are meant to change, followed by cells that run correctly without needing to be understood line by line on first read. You are never handed a blank cell and asked to write code from nothing — every session asks you to run real, working code, then deliberately change something specific in it and see what happens.</w:t>
+        <w:t xml:space="preserve">The module opens with real data, not AI: Session 1 works entirely with real measurements — rock densities, geochemical concentrations, a two-species depth/size dataset, and a fault-orientation survey — computing the same summary statistics (and the specialised tools directional data needs) a geologist would use in any field report, before any model of any kind gets fitted to anything. Every notebook from Session 2 onward then follows the same pattern as the companion module's pygplates workflows: a USER CONFIGURATION cell near the top marks the handful of things you are meant to change, followed by cells that run correctly without needing to be understood line by line on first read. You are never handed a blank cell and asked to write code from nothing — every session asks you to run real, working code, then deliberately change something specific in it and see what happens.</w:t>
       </w:r>
     </w:p>
     <w:p>
@@ -473,7 +473,7 @@
               <w:spacing w:after="0"/>
             </w:pPr>
             <w:r>
-              <w:t xml:space="preserve">Using real rock density measurements and real lead/zinc geochemical concentrations, compute and interpret the mean, median, standard deviation, and percentiles of a dataset; build a histogram with a defensible bin count; and see first-hand why right-skewed geochemical data is usually analysed after a log transform.</w:t>
+              <w:t xml:space="preserve">Using real rock density measurements and real lead/zinc geochemical concentrations, compute and interpret the mean, median, standard deviation, and percentiles of a dataset; build a histogram with a defensible bin count; and see first-hand why right-skewed geochemical data is usually analysed after a log transform. Then, with two more real datasets, compute a rank-based correlation and learn why compass-direction data (like fault orientations) needs its own tools: rose diagrams, a test for a real preferred direction, and a stereonet.</w:t>
             </w:r>
           </w:p>
         </w:tc>
@@ -1235,7 +1235,7 @@
         <w:spacing w:after="160"/>
       </w:pPr>
       <w:r>
-        <w:t xml:space="preserve">If you would rather work locally and already have a Python environment you're comfortable with, every notebook only depends on NumPy, Matplotlib, and scikit-learn:</w:t>
+        <w:t xml:space="preserve">If you would rather work locally and already have a Python environment you're comfortable with, every notebook only depends on NumPy, SciPy, Matplotlib, and scikit-learn:</w:t>
       </w:r>
     </w:p>
     <w:p>
@@ -1254,11 +1254,6 @@
           <w:rFonts w:ascii="Consolas" w:cs="Consolas" w:eastAsia="Consolas" w:hAnsi="Consolas"/>
         </w:rPr>
         <w:t xml:space="preserve">pip install -r requirements.txt</w:t>
-      </w:r>
-      <w:r>
-        <w:rPr>
-          <w:rFonts w:ascii="Consolas" w:cs="Consolas" w:eastAsia="Consolas" w:hAnsi="Consolas"/>
-        </w:rPr>
         <w:br/>
         <w:t xml:space="preserve">jupyter notebook</w:t>
       </w:r>
@@ -1450,7 +1445,7 @@
         <w:spacing w:after="160"/>
       </w:pPr>
       <w:r>
-        <w:t xml:space="preserve">Session 1's real density and geochemistry data are not drawn from any of the above — they come from a historical University of Sydney statistics-for-geoscientists course.</w:t>
+        <w:t xml:space="preserve">Session 1's real data (density, geochemistry, and the depth/size and fault-orientation datasets) are not drawn from any of the above — they come from a historical University of Sydney statistics-for-geoscientists course.</w:t>
       </w:r>
     </w:p>
     <w:p>

</xml_diff>

<commit_message>
Remove remaining module-numbering language; keep sessions standalone
</commit_message>
<xml_diff>
--- a/Student_Manual.docx
+++ b/Student_Manual.docx
@@ -75,7 +75,7 @@
         <w:spacing w:after="160"/>
       </w:pPr>
       <w:r>
-        <w:t xml:space="preserve">You will not leave this module able to design a machine-learning system from scratch, and that is deliberate. The aim is narrower and more achievable: to compute and interpret the summary statistics any real dataset deserves before any modelling starts, to open a real, working AI/ML notebook, understand what each part of it is doing, deliberately change something in it, correctly predict what should happen as a result, and recognise the difference between a method that is working well and one that has quietly started extrapolating beyond what it actually knows. Some notebooks in the companion module — the detrital-zircon tectonic-setting predictor, the porphyry-copper prospectivity maps — are themselves applications of the same ideas this module teaches from first principles.</w:t>
+        <w:t xml:space="preserve">You will not leave this module able to design a machine-learning system from scratch, and that is deliberate. The aim is narrower and more achievable: to compute and interpret the summary statistics any real dataset deserves before any modelling starts, to open a real, working AI/ML notebook, understand what each part of it is doing, deliberately change something in it, correctly predict what should happen as a result, and recognise the difference between a method that is working well and one that has quietly started extrapolating beyond what it actually knows. Some real, published Earth-science notebooks — a detrital-zircon tectonic-setting predictor, porphyry-copper prospectivity maps — are themselves applications of the same ideas this module teaches from first principles.</w:t>
       </w:r>
     </w:p>
     <w:p>
@@ -105,7 +105,7 @@
         <w:spacing w:after="160"/>
       </w:pPr>
       <w:r>
-        <w:t xml:space="preserve">A few sessions refer back to specific notebooks and a specific paper from the companion module, Earth Evolution — Spatio-Temporal Data and Model Analysis (T15, T24, and T73–T80, and Farahbakhsh et al. 2025). Having taken that module, or being generally familiar with plate-tectonic reconstructions, makes those references land a little more easily, but each one is explained again in context here, so it is not a prerequisite.</w:t>
+        <w:t xml:space="preserve">A few sessions refer back to specific notebooks and a specific paper from Earth Evolution — Spatio-Temporal Data and Model Analysis (T15, T24, and T73–T80, and Farahbakhsh et al. 2025). Being generally familiar with plate-tectonic reconstructions makes those references land a little more easily, but each one is explained again in context here, so it is not a prerequisite.</w:t>
       </w:r>
     </w:p>
     <w:p>
@@ -248,7 +248,7 @@
         <w:spacing w:after="160"/>
       </w:pPr>
       <w:r>
-        <w:t xml:space="preserve">The module opens with real data, not AI: Session 1 works entirely with real measurements — rock densities, geochemical concentrations, a two-species depth/size dataset, and a fault-orientation survey — computing the same summary statistics (and the specialised tools directional data needs) a geologist would use in any field report, before any model of any kind gets fitted to anything. Every notebook from Session 2 onward then follows the same pattern as the companion module's pygplates workflows: a USER CONFIGURATION cell near the top marks the handful of things you are meant to change, followed by cells that run correctly without needing to be understood line by line on first read. You are never handed a blank cell and asked to write code from nothing — every session asks you to run real, working code, then deliberately change something specific in it and see what happens.</w:t>
+        <w:t xml:space="preserve">The module opens with real data, not AI: Session 1 works entirely with real measurements — rock densities, geochemical concentrations, a two-species depth/size dataset, and a fault-orientation survey — computing the same summary statistics (and the specialised tools directional data needs) a geologist would use in any field report, before any model of any kind gets fitted to anything. Every notebook from Session 2 onward then follows the same pattern throughout: a USER CONFIGURATION cell near the top marks the handful of things you are meant to change, followed by cells that run correctly without needing to be understood line by line on first read. You are never handed a blank cell and asked to write code from nothing — every session asks you to run real, working code, then deliberately change something specific in it and see what happens.</w:t>
       </w:r>
     </w:p>
     <w:p>
@@ -785,7 +785,7 @@
               <w:spacing w:after="0"/>
             </w:pPr>
             <w:r>
-              <w:t xml:space="preserve">The classification idea again, applied to a simplified mineral-prospectivity model in the spirit of Farahbakhsh et al. (2025) — the paper behind the companion module's porphyry-copper notebooks. You change a threshold or input feature and watch the predicted “target zone” map respond.</w:t>
+              <w:t xml:space="preserve">The classification idea again, applied to a simplified mineral-prospectivity model in the spirit of Farahbakhsh et al. (2025) — a real published porphyry-copper prospectivity study. You change a threshold or input feature and watch the predicted “target zone” map respond.</w:t>
             </w:r>
           </w:p>
         </w:tc>

</xml_diff>